<commit_message>
Rapora kod ve tekrarlanabilirlik bölümü eklendi
</commit_message>
<xml_diff>
--- a/At_Yarisi_Siralama_Tahmini_Rapor.docx
+++ b/At_Yarisi_Siralama_Tahmini_Rapor.docx
@@ -176,7 +176,7 @@
       <w:r>
         <w:drawing>
           <wp:inline xmlns:a="http://schemas.openxmlformats.org/drawingml/2006/main" xmlns:pic="http://schemas.openxmlformats.org/drawingml/2006/picture">
-            <wp:extent cx="4680000" cy="2171712"/>
+            <wp:extent cx="4320000" cy="2004658"/>
             <wp:docPr id="1" name="Picture 1"/>
             <wp:cNvGraphicFramePr>
               <a:graphicFrameLocks noChangeAspect="1"/>
@@ -197,7 +197,7 @@
                   <pic:spPr>
                     <a:xfrm>
                       <a:off x="0" y="0"/>
-                      <a:ext cx="4680000" cy="2171712"/>
+                      <a:ext cx="4320000" cy="2004658"/>
                     </a:xfrm>
                     <a:prstGeom prst="rect"/>
                   </pic:spPr>
@@ -239,7 +239,7 @@
       <w:r>
         <w:drawing>
           <wp:inline xmlns:a="http://schemas.openxmlformats.org/drawingml/2006/main" xmlns:pic="http://schemas.openxmlformats.org/drawingml/2006/picture">
-            <wp:extent cx="4320000" cy="1994412"/>
+            <wp:extent cx="3780000" cy="1745111"/>
             <wp:docPr id="2" name="Picture 2"/>
             <wp:cNvGraphicFramePr>
               <a:graphicFrameLocks noChangeAspect="1"/>
@@ -260,7 +260,7 @@
                   <pic:spPr>
                     <a:xfrm>
                       <a:off x="0" y="0"/>
-                      <a:ext cx="4320000" cy="1994412"/>
+                      <a:ext cx="3780000" cy="1745111"/>
                     </a:xfrm>
                     <a:prstGeom prst="rect"/>
                   </pic:spPr>
@@ -498,7 +498,7 @@
       <w:r>
         <w:drawing>
           <wp:inline xmlns:a="http://schemas.openxmlformats.org/drawingml/2006/main" xmlns:pic="http://schemas.openxmlformats.org/drawingml/2006/picture">
-            <wp:extent cx="5040000" cy="1685172"/>
+            <wp:extent cx="4320000" cy="1444433"/>
             <wp:docPr id="3" name="Picture 3"/>
             <wp:cNvGraphicFramePr>
               <a:graphicFrameLocks noChangeAspect="1"/>
@@ -519,7 +519,7 @@
                   <pic:spPr>
                     <a:xfrm>
                       <a:off x="0" y="0"/>
-                      <a:ext cx="5040000" cy="1685172"/>
+                      <a:ext cx="4320000" cy="1444433"/>
                     </a:xfrm>
                     <a:prstGeom prst="rect"/>
                   </pic:spPr>
@@ -1442,7 +1442,7 @@
       <w:r>
         <w:drawing>
           <wp:inline xmlns:a="http://schemas.openxmlformats.org/drawingml/2006/main" xmlns:pic="http://schemas.openxmlformats.org/drawingml/2006/picture">
-            <wp:extent cx="5220000" cy="2138995"/>
+            <wp:extent cx="4500000" cy="1843962"/>
             <wp:docPr id="4" name="Picture 4"/>
             <wp:cNvGraphicFramePr>
               <a:graphicFrameLocks noChangeAspect="1"/>
@@ -1463,7 +1463,7 @@
                   <pic:spPr>
                     <a:xfrm>
                       <a:off x="0" y="0"/>
-                      <a:ext cx="5220000" cy="2138995"/>
+                      <a:ext cx="4500000" cy="1843962"/>
                     </a:xfrm>
                     <a:prstGeom prst="rect"/>
                   </pic:spPr>
@@ -1505,7 +1505,7 @@
       <w:r>
         <w:drawing>
           <wp:inline xmlns:a="http://schemas.openxmlformats.org/drawingml/2006/main" xmlns:pic="http://schemas.openxmlformats.org/drawingml/2006/picture">
-            <wp:extent cx="4500000" cy="1906667"/>
+            <wp:extent cx="3960000" cy="1677867"/>
             <wp:docPr id="5" name="Picture 5"/>
             <wp:cNvGraphicFramePr>
               <a:graphicFrameLocks noChangeAspect="1"/>
@@ -1526,7 +1526,7 @@
                   <pic:spPr>
                     <a:xfrm>
                       <a:off x="0" y="0"/>
-                      <a:ext cx="4500000" cy="1906667"/>
+                      <a:ext cx="3960000" cy="1677867"/>
                     </a:xfrm>
                     <a:prstGeom prst="rect"/>
                   </pic:spPr>
@@ -1576,7 +1576,7 @@
       <w:r>
         <w:drawing>
           <wp:inline xmlns:a="http://schemas.openxmlformats.org/drawingml/2006/main" xmlns:pic="http://schemas.openxmlformats.org/drawingml/2006/picture">
-            <wp:extent cx="3960000" cy="2938826"/>
+            <wp:extent cx="3240000" cy="2404494"/>
             <wp:docPr id="6" name="Picture 6"/>
             <wp:cNvGraphicFramePr>
               <a:graphicFrameLocks noChangeAspect="1"/>
@@ -1597,7 +1597,7 @@
                   <pic:spPr>
                     <a:xfrm>
                       <a:off x="0" y="0"/>
-                      <a:ext cx="3960000" cy="2938826"/>
+                      <a:ext cx="3240000" cy="2404494"/>
                     </a:xfrm>
                     <a:prstGeom prst="rect"/>
                   </pic:spPr>
@@ -1840,6 +1840,70 @@
       </w:r>
       <w:r>
         <w:t xml:space="preserve"> Daha güncel yarışları (ör. TJK verisi) ekleyerek modelin farklı pistlere genellenip genellenmediğini test etmek.</w:t>
+      </w:r>
+    </w:p>
+    <w:p>
+      <w:pPr>
+        <w:pStyle w:val="Heading1"/>
+      </w:pPr>
+      <w:r>
+        <w:t>9. Kod ve Tekrarlanabilirlik</w:t>
+      </w:r>
+    </w:p>
+    <w:p>
+      <w:pPr>
+        <w:jc w:val="both"/>
+      </w:pPr>
+      <w:r>
+        <w:rPr>
+          <w:i w:val="0"/>
+        </w:rPr>
+        <w:t>Projenin tüm kodu, çalıştırılmış notebook'u, grafikleri ve bu rapor GitHub deposunda yer almaktadır: https://github.com/Elif-Yildiz/at-yarisi-siralama-tahmini</w:t>
+      </w:r>
+    </w:p>
+    <w:p>
+      <w:pPr>
+        <w:pStyle w:val="ListBullet"/>
+        <w:spacing w:after="40"/>
+      </w:pPr>
+      <w:r>
+        <w:rPr>
+          <w:b/>
+        </w:rPr>
+        <w:t>at_yarisi_siralama.ipynb:</w:t>
+      </w:r>
+      <w:r>
+        <w:t xml:space="preserve"> veri keşfi, ön işleme, modeller, değerlendirme ve hata analizinin tamamı (çıktılarıyla).</w:t>
+      </w:r>
+    </w:p>
+    <w:p>
+      <w:pPr>
+        <w:pStyle w:val="ListBullet"/>
+        <w:spacing w:after="40"/>
+      </w:pPr>
+      <w:r>
+        <w:rPr>
+          <w:b/>
+        </w:rPr>
+        <w:t>figures/:</w:t>
+      </w:r>
+      <w:r>
+        <w:t xml:space="preserve"> rapordaki tüm grafikler ve sonuç tabloları (model_results.csv, betting_roi.csv).</w:t>
+      </w:r>
+    </w:p>
+    <w:p>
+      <w:pPr>
+        <w:pStyle w:val="ListBullet"/>
+        <w:spacing w:after="40"/>
+      </w:pPr>
+      <w:r>
+        <w:rPr>
+          <w:b/>
+        </w:rPr>
+        <w:t>Veri:</w:t>
+      </w:r>
+      <w:r>
+        <w:t xml:space="preserve"> veri seti lisans gereği depoya eklenmemiştir. Kaggle'dan indirilen races.csv ve runs.csv dosyaları data/ klasörüne konularak notebook baştan çalıştırılabilir. Rastgelelik içeren adımlarda sabit tohum (random_state = 42) kullanıldığından sonuçlar yeniden üretilebilir.</w:t>
       </w:r>
     </w:p>
     <w:sectPr>

</xml_diff>